<commit_message>
Tier-2 result: Spider dev EX = 64.8% (full 1034), documented gap
Full Spider-dev evaluation of codes-1b-spider (run T2-001): EX 64.8% (670/1034,
92.9% executed) vs paper 77.9% — outside +/-10% tolerance, documented cause:
schema+FK prompt instead of the authors' full database prompt (schema filter +
BM25 value retriever + metadata) the SFT model expects. Honest reporting per SOP.

- Deck: results table + enhancement slide updated to 64.8% with the cause
- Reproducibility report: Tier-2 section now reports the executed result + gap
  analysis + improvement plan; Appendix A.1 logs T2-001
- DELIVERABLES: Month-2 reproduction rows updated

Co-Authored-By: Claude Opus 4.8 <noreply@anthropic.com>
</commit_message>
<xml_diff>
--- a/docs/Code_Reproducibility_Report_v1.docx
+++ b/docs/Code_Reproducibility_Report_v1.docx
@@ -269,7 +269,7 @@
           <w:sz w:val="22"/>
           <w:szCs w:val="22"/>
         </w:rPr>
-        <w:t xml:space="preserve">Summary of status: the released CodeS-1B model has been loaded, has generated valid SQL, and that SQL has executed correctly on both a CUDA GPU (Colab T4) and Apple Silicon (M4). A full local application has been implemented that reproduces the CodeS inference pipeline and adds execution-guided self-correction. The faithful Spider evaluation (Tier 2) is prepared and scheduled for Month 2. The main outstanding risk is that Tier 2 requires a CUDA machine with the authors’ pinned software stack.</w:t>
+        <w:t xml:space="preserve">Summary of status: the released CodeS-1B model has been loaded, has generated valid SQL, and that SQL has executed correctly on both a CUDA GPU (Colab T4) and Apple Silicon (M4). A full local application has been implemented that reproduces the CodeS inference pipeline and adds execution-guided self-correction. The Tier-2 Spider evaluation has been run (inference-only, on the Mac — no CUDA training libraries needed): Execution Accuracy = 64.8% on the full 1,034-example development set. This is below the paper’s 77.9% and outside the ±10% tolerance; the gap is documented and attributed to prompt fidelity (a schema+FK prompt rather than the authors’ full database prompt), with a concrete plan to close it.</w:t>
       </w:r>
     </w:p>
     <w:p>
@@ -3091,7 +3091,7 @@
           <w:sz w:val="30"/>
           <w:szCs w:val="30"/>
         </w:rPr>
-        <w:t xml:space="preserve">6. Tier 2 — Faithful Reproduction (plan and status)</w:t>
+        <w:t xml:space="preserve">6. Tier 2 — Spider dev Execution Accuracy (executed)</w:t>
       </w:r>
     </w:p>
     <w:p>
@@ -3104,17 +3104,12 @@
           <w:sz w:val="22"/>
           <w:szCs w:val="22"/>
         </w:rPr>
-        <w:t xml:space="preserve">Status: not yet executed. Tier 2 is scheduled for Month 2 (Weeks 5–8) and requires a CUDA machine. The planned procedure is:</w:t>
-      </w:r>
-    </w:p>
-    <w:p>
-      <w:pPr>
-        <w:pStyle w:val="ListParagraph"/>
-        <w:numPr>
-          <w:ilvl w:val="0"/>
-          <w:numId w:val="1"/>
-        </w:numPr>
-        <w:spacing w:after="60" w:line="276"/>
+        <w:t xml:space="preserve">Tier 2 was executed as an inference-only reproduction, which does not require the authors’ CUDA-only training libraries. Using the released fine-tuned checkpoint seeklhy/codes-1b-spider, SQL was generated for every one of the 1,034 Spider development questions with beam search (4 beams) and executed against the real Spider SQLite databases; a prediction is counted correct when its result set matches the gold query’s result set (Execution Accuracy).</w:t>
+      </w:r>
+    </w:p>
+    <w:p>
+      <w:pPr>
+        <w:spacing w:after="120" w:line="276"/>
       </w:pPr>
       <w:r>
         <w:rPr>
@@ -3122,17 +3117,29 @@
           <w:sz w:val="22"/>
           <w:szCs w:val="22"/>
         </w:rPr>
-        <w:t xml:space="preserve">Create an isolated Python 3.8.5 environment (condacolab) and install the pinned dependencies from Section 4.2; install Java 11 for pyserini and the SimCSE fork.</w:t>
-      </w:r>
-    </w:p>
-    <w:p>
-      <w:pPr>
-        <w:pStyle w:val="ListParagraph"/>
-        <w:numPr>
-          <w:ilvl w:val="0"/>
-          <w:numId w:val="1"/>
-        </w:numPr>
-        <w:spacing w:after="60" w:line="276"/>
+        <w:t xml:space="preserve">Result (run T2-001): Execution Accuracy = 64.8% (670 / 1,034 correct); 92.9% of predicted queries executed without error; wall-clock 6,538 s on an Apple M4 (MPS). This is below the paper’s reported 77.9% and outside the SOP ±10% tolerance band (70.1–85.7%).</w:t>
+      </w:r>
+    </w:p>
+    <w:p>
+      <w:pPr>
+        <w:pStyle w:val="Heading2"/>
+        <w:spacing w:after="80" w:before="160"/>
+      </w:pPr>
+      <w:r>
+        <w:rPr>
+          <w:rFonts w:ascii="Calibri" w:cs="Calibri" w:eastAsia="Calibri" w:hAnsi="Calibri"/>
+          <w:b/>
+          <w:bCs/>
+          <w:color w:val="2E5496"/>
+          <w:sz w:val="25"/>
+          <w:szCs w:val="25"/>
+        </w:rPr>
+        <w:t xml:space="preserve">6.1 Documented cause of the gap</w:t>
+      </w:r>
+    </w:p>
+    <w:p>
+      <w:pPr>
+        <w:spacing w:after="120" w:line="276"/>
       </w:pPr>
       <w:r>
         <w:rPr>
@@ -3140,17 +3147,29 @@
           <w:sz w:val="22"/>
           <w:szCs w:val="22"/>
         </w:rPr>
-        <w:t xml:space="preserve">Download data.zip, sic_ckpts.zip and test_suite_sql_eval.zip and unpack them into the cloned repository.</w:t>
-      </w:r>
-    </w:p>
-    <w:p>
-      <w:pPr>
-        <w:pStyle w:val="ListParagraph"/>
-        <w:numPr>
-          <w:ilvl w:val="0"/>
-          <w:numId w:val="1"/>
-        </w:numPr>
-        <w:spacing w:after="60" w:line="276"/>
+        <w:t xml:space="preserve">The −13.1-point gap is attributed primarily to prompt fidelity. The seeklhy/codes-1b-spider checkpoint was fine-tuned on the authors’ full database prompt — schema-filtered tables and columns, cell values matched by the BM25 + LCS value retriever, and metadata (column types, comments, representative values, primary/foreign keys). This reproduction fed a simpler prompt (schema + foreign keys only), so the model receives less of the context it was trained to use, which especially harms predicates that depend on matched cell values. A secondary factor is that Execution Accuracy here is computed by result-set comparison rather than the official test-suite script. Both are legitimate documented deviations rather than defects to conceal.</w:t>
+      </w:r>
+    </w:p>
+    <w:p>
+      <w:pPr>
+        <w:pStyle w:val="Heading2"/>
+        <w:spacing w:after="80" w:before="160"/>
+      </w:pPr>
+      <w:r>
+        <w:rPr>
+          <w:rFonts w:ascii="Calibri" w:cs="Calibri" w:eastAsia="Calibri" w:hAnsi="Calibri"/>
+          <w:b/>
+          <w:bCs/>
+          <w:color w:val="2E5496"/>
+          <w:sz w:val="25"/>
+          <w:szCs w:val="25"/>
+        </w:rPr>
+        <w:t xml:space="preserve">6.2 Planned improvement and remaining runs</w:t>
+      </w:r>
+    </w:p>
+    <w:p>
+      <w:pPr>
+        <w:spacing w:after="120" w:line="276"/>
       </w:pPr>
       <w:r>
         <w:rPr>
@@ -3158,43 +3177,7 @@
           <w:sz w:val="22"/>
           <w:szCs w:val="22"/>
         </w:rPr>
-        <w:t xml:space="preserve">Run the authors’ evaluation script (run_sft_evaluations.sh) for CodeS-1B on the Spider development set, reducing the batch size to fit a single GPU.</w:t>
-      </w:r>
-    </w:p>
-    <w:p>
-      <w:pPr>
-        <w:pStyle w:val="ListParagraph"/>
-        <w:numPr>
-          <w:ilvl w:val="0"/>
-          <w:numId w:val="1"/>
-        </w:numPr>
-        <w:spacing w:after="60" w:line="276"/>
-      </w:pPr>
-      <w:r>
-        <w:rPr>
-          <w:rFonts w:ascii="Calibri" w:cs="Calibri" w:eastAsia="Calibri" w:hAnsi="Calibri"/>
-          <w:sz w:val="22"/>
-          <w:szCs w:val="22"/>
-        </w:rPr>
-        <w:t xml:space="preserve">Record EX and TS, repeat the run three times with fixed seeds, and log each run (metric, runtime, hardware, versions) as required for the Week-5 reproduction log.</w:t>
-      </w:r>
-    </w:p>
-    <w:p>
-      <w:pPr>
-        <w:pStyle w:val="ListParagraph"/>
-        <w:numPr>
-          <w:ilvl w:val="0"/>
-          <w:numId w:val="1"/>
-        </w:numPr>
-        <w:spacing w:after="60" w:line="276"/>
-      </w:pPr>
-      <w:r>
-        <w:rPr>
-          <w:rFonts w:ascii="Calibri" w:cs="Calibri" w:eastAsia="Calibri" w:hAnsi="Calibri"/>
-          <w:sz w:val="22"/>
-          <w:szCs w:val="22"/>
-        </w:rPr>
-        <w:t xml:space="preserve">Compare the reproduced EX against the target 77.9% under the ±5–10% tolerance and document any gap with its cause.</w:t>
+        <w:t xml:space="preserve">To close the gap toward 77.9%, the next step is to construct the authors’ full database prompt (schema filter + value retriever + metadata) using the released sic_ckpts and a per-database BM25 index, and to adopt the official test-suite evaluation. Two further runs will then be logged to complete the three-run Week-5 requirement (beam search is deterministic, so runs vary only by documented configuration changes rather than by random seed).</w:t>
       </w:r>
     </w:p>
     <w:p>
@@ -6684,6 +6667,557 @@
                 <w:szCs w:val="20"/>
               </w:rPr>
               <w:t xml:space="preserve">2026-08-14</w:t>
+            </w:r>
+          </w:p>
+        </w:tc>
+      </w:tr>
+    </w:tbl>
+    <w:p>
+      <w:pPr>
+        <w:pStyle w:val="Heading2"/>
+        <w:spacing w:after="80" w:before="160"/>
+      </w:pPr>
+      <w:r>
+        <w:rPr>
+          <w:rFonts w:ascii="Calibri" w:cs="Calibri" w:eastAsia="Calibri" w:hAnsi="Calibri"/>
+          <w:b/>
+          <w:bCs/>
+          <w:color w:val="2E5496"/>
+          <w:sz w:val="25"/>
+          <w:szCs w:val="25"/>
+        </w:rPr>
+        <w:t xml:space="preserve">Appendix A.1 — Tier-2 run (T2-001)</w:t>
+      </w:r>
+    </w:p>
+    <w:tbl>
+      <w:tblPr>
+        <w:tblW w:type="dxa" w:w="9026"/>
+        <w:tblBorders>
+          <w:top w:val="single" w:color="auto" w:sz="4"/>
+          <w:left w:val="single" w:color="auto" w:sz="4"/>
+          <w:bottom w:val="single" w:color="auto" w:sz="4"/>
+          <w:right w:val="single" w:color="auto" w:sz="4"/>
+          <w:insideH w:val="single" w:color="auto" w:sz="4"/>
+          <w:insideV w:val="single" w:color="auto" w:sz="4"/>
+        </w:tblBorders>
+      </w:tblPr>
+      <w:tblGrid>
+        <w:gridCol w:w="3026"/>
+        <w:gridCol w:w="6000"/>
+      </w:tblGrid>
+      <w:tr>
+        <w:trPr>
+          <w:tblHeader/>
+        </w:trPr>
+        <w:tc>
+          <w:tcPr>
+            <w:tcW w:type="dxa" w:w="3026"/>
+            <w:shd w:fill="1F3864" w:color="auto" w:val="clear"/>
+            <w:tcMar>
+              <w:top w:type="dxa" w:w="40"/>
+              <w:left w:type="dxa" w:w="80"/>
+              <w:bottom w:type="dxa" w:w="40"/>
+              <w:right w:type="dxa" w:w="80"/>
+            </w:tcMar>
+          </w:tcPr>
+          <w:p>
+            <w:pPr>
+              <w:spacing w:after="0" w:line="260"/>
+            </w:pPr>
+            <w:r>
+              <w:rPr>
+                <w:rFonts w:ascii="Calibri" w:cs="Calibri" w:eastAsia="Calibri" w:hAnsi="Calibri"/>
+                <w:b/>
+                <w:bCs/>
+                <w:color w:val="FFFFFF"/>
+                <w:sz w:val="20"/>
+                <w:szCs w:val="20"/>
+              </w:rPr>
+              <w:t xml:space="preserve">Field</w:t>
+            </w:r>
+          </w:p>
+        </w:tc>
+        <w:tc>
+          <w:tcPr>
+            <w:tcW w:type="dxa" w:w="6000"/>
+            <w:shd w:fill="1F3864" w:color="auto" w:val="clear"/>
+            <w:tcMar>
+              <w:top w:type="dxa" w:w="40"/>
+              <w:left w:type="dxa" w:w="80"/>
+              <w:bottom w:type="dxa" w:w="40"/>
+              <w:right w:type="dxa" w:w="80"/>
+            </w:tcMar>
+          </w:tcPr>
+          <w:p>
+            <w:pPr>
+              <w:spacing w:after="0" w:line="260"/>
+            </w:pPr>
+            <w:r>
+              <w:rPr>
+                <w:rFonts w:ascii="Calibri" w:cs="Calibri" w:eastAsia="Calibri" w:hAnsi="Calibri"/>
+                <w:b/>
+                <w:bCs/>
+                <w:color w:val="FFFFFF"/>
+                <w:sz w:val="20"/>
+                <w:szCs w:val="20"/>
+              </w:rPr>
+              <w:t xml:space="preserve">Value</w:t>
+            </w:r>
+          </w:p>
+        </w:tc>
+      </w:tr>
+      <w:tr>
+        <w:tc>
+          <w:tcPr>
+            <w:tcW w:type="dxa" w:w="3026"/>
+            <w:tcMar>
+              <w:top w:type="dxa" w:w="40"/>
+              <w:left w:type="dxa" w:w="80"/>
+              <w:bottom w:type="dxa" w:w="40"/>
+              <w:right w:type="dxa" w:w="80"/>
+            </w:tcMar>
+          </w:tcPr>
+          <w:p>
+            <w:pPr>
+              <w:spacing w:after="0" w:line="260"/>
+            </w:pPr>
+            <w:r>
+              <w:rPr>
+                <w:rFonts w:ascii="Calibri" w:cs="Calibri" w:eastAsia="Calibri" w:hAnsi="Calibri"/>
+                <w:b w:val="false"/>
+                <w:bCs w:val="false"/>
+                <w:color w:val="000000"/>
+                <w:sz w:val="20"/>
+                <w:szCs w:val="20"/>
+              </w:rPr>
+              <w:t xml:space="preserve">run_id</w:t>
+            </w:r>
+          </w:p>
+        </w:tc>
+        <w:tc>
+          <w:tcPr>
+            <w:tcW w:type="dxa" w:w="6000"/>
+            <w:tcMar>
+              <w:top w:type="dxa" w:w="40"/>
+              <w:left w:type="dxa" w:w="80"/>
+              <w:bottom w:type="dxa" w:w="40"/>
+              <w:right w:type="dxa" w:w="80"/>
+            </w:tcMar>
+          </w:tcPr>
+          <w:p>
+            <w:pPr>
+              <w:spacing w:after="0" w:line="260"/>
+            </w:pPr>
+            <w:r>
+              <w:rPr>
+                <w:rFonts w:ascii="Calibri" w:cs="Calibri" w:eastAsia="Calibri" w:hAnsi="Calibri"/>
+                <w:b w:val="false"/>
+                <w:bCs w:val="false"/>
+                <w:color w:val="000000"/>
+                <w:sz w:val="20"/>
+                <w:szCs w:val="20"/>
+              </w:rPr>
+              <w:t xml:space="preserve">T2-001</w:t>
+            </w:r>
+          </w:p>
+        </w:tc>
+      </w:tr>
+      <w:tr>
+        <w:tc>
+          <w:tcPr>
+            <w:tcW w:type="dxa" w:w="3026"/>
+            <w:shd w:fill="EAF0F9" w:color="auto" w:val="clear"/>
+            <w:tcMar>
+              <w:top w:type="dxa" w:w="40"/>
+              <w:left w:type="dxa" w:w="80"/>
+              <w:bottom w:type="dxa" w:w="40"/>
+              <w:right w:type="dxa" w:w="80"/>
+            </w:tcMar>
+          </w:tcPr>
+          <w:p>
+            <w:pPr>
+              <w:spacing w:after="0" w:line="260"/>
+            </w:pPr>
+            <w:r>
+              <w:rPr>
+                <w:rFonts w:ascii="Calibri" w:cs="Calibri" w:eastAsia="Calibri" w:hAnsi="Calibri"/>
+                <w:b w:val="false"/>
+                <w:bCs w:val="false"/>
+                <w:color w:val="000000"/>
+                <w:sz w:val="20"/>
+                <w:szCs w:val="20"/>
+              </w:rPr>
+              <w:t xml:space="preserve">model</w:t>
+            </w:r>
+          </w:p>
+        </w:tc>
+        <w:tc>
+          <w:tcPr>
+            <w:tcW w:type="dxa" w:w="6000"/>
+            <w:shd w:fill="EAF0F9" w:color="auto" w:val="clear"/>
+            <w:tcMar>
+              <w:top w:type="dxa" w:w="40"/>
+              <w:left w:type="dxa" w:w="80"/>
+              <w:bottom w:type="dxa" w:w="40"/>
+              <w:right w:type="dxa" w:w="80"/>
+            </w:tcMar>
+          </w:tcPr>
+          <w:p>
+            <w:pPr>
+              <w:spacing w:after="0" w:line="260"/>
+            </w:pPr>
+            <w:r>
+              <w:rPr>
+                <w:rFonts w:ascii="Calibri" w:cs="Calibri" w:eastAsia="Calibri" w:hAnsi="Calibri"/>
+                <w:b w:val="false"/>
+                <w:bCs w:val="false"/>
+                <w:color w:val="000000"/>
+                <w:sz w:val="20"/>
+                <w:szCs w:val="20"/>
+              </w:rPr>
+              <w:t xml:space="preserve">seeklhy/codes-1b-spider (SFT)</w:t>
+            </w:r>
+          </w:p>
+        </w:tc>
+      </w:tr>
+      <w:tr>
+        <w:tc>
+          <w:tcPr>
+            <w:tcW w:type="dxa" w:w="3026"/>
+            <w:tcMar>
+              <w:top w:type="dxa" w:w="40"/>
+              <w:left w:type="dxa" w:w="80"/>
+              <w:bottom w:type="dxa" w:w="40"/>
+              <w:right w:type="dxa" w:w="80"/>
+            </w:tcMar>
+          </w:tcPr>
+          <w:p>
+            <w:pPr>
+              <w:spacing w:after="0" w:line="260"/>
+            </w:pPr>
+            <w:r>
+              <w:rPr>
+                <w:rFonts w:ascii="Calibri" w:cs="Calibri" w:eastAsia="Calibri" w:hAnsi="Calibri"/>
+                <w:b w:val="false"/>
+                <w:bCs w:val="false"/>
+                <w:color w:val="000000"/>
+                <w:sz w:val="20"/>
+                <w:szCs w:val="20"/>
+              </w:rPr>
+              <w:t xml:space="preserve">dataset</w:t>
+            </w:r>
+          </w:p>
+        </w:tc>
+        <w:tc>
+          <w:tcPr>
+            <w:tcW w:type="dxa" w:w="6000"/>
+            <w:tcMar>
+              <w:top w:type="dxa" w:w="40"/>
+              <w:left w:type="dxa" w:w="80"/>
+              <w:bottom w:type="dxa" w:w="40"/>
+              <w:right w:type="dxa" w:w="80"/>
+            </w:tcMar>
+          </w:tcPr>
+          <w:p>
+            <w:pPr>
+              <w:spacing w:after="0" w:line="260"/>
+            </w:pPr>
+            <w:r>
+              <w:rPr>
+                <w:rFonts w:ascii="Calibri" w:cs="Calibri" w:eastAsia="Calibri" w:hAnsi="Calibri"/>
+                <w:b w:val="false"/>
+                <w:bCs w:val="false"/>
+                <w:color w:val="000000"/>
+                <w:sz w:val="20"/>
+                <w:szCs w:val="20"/>
+              </w:rPr>
+              <w:t xml:space="preserve">Spider dev — full 1,034 examples</w:t>
+            </w:r>
+          </w:p>
+        </w:tc>
+      </w:tr>
+      <w:tr>
+        <w:tc>
+          <w:tcPr>
+            <w:tcW w:type="dxa" w:w="3026"/>
+            <w:shd w:fill="EAF0F9" w:color="auto" w:val="clear"/>
+            <w:tcMar>
+              <w:top w:type="dxa" w:w="40"/>
+              <w:left w:type="dxa" w:w="80"/>
+              <w:bottom w:type="dxa" w:w="40"/>
+              <w:right w:type="dxa" w:w="80"/>
+            </w:tcMar>
+          </w:tcPr>
+          <w:p>
+            <w:pPr>
+              <w:spacing w:after="0" w:line="260"/>
+            </w:pPr>
+            <w:r>
+              <w:rPr>
+                <w:rFonts w:ascii="Calibri" w:cs="Calibri" w:eastAsia="Calibri" w:hAnsi="Calibri"/>
+                <w:b w:val="false"/>
+                <w:bCs w:val="false"/>
+                <w:color w:val="000000"/>
+                <w:sz w:val="20"/>
+                <w:szCs w:val="20"/>
+              </w:rPr>
+              <w:t xml:space="preserve">metric</w:t>
+            </w:r>
+          </w:p>
+        </w:tc>
+        <w:tc>
+          <w:tcPr>
+            <w:tcW w:type="dxa" w:w="6000"/>
+            <w:shd w:fill="EAF0F9" w:color="auto" w:val="clear"/>
+            <w:tcMar>
+              <w:top w:type="dxa" w:w="40"/>
+              <w:left w:type="dxa" w:w="80"/>
+              <w:bottom w:type="dxa" w:w="40"/>
+              <w:right w:type="dxa" w:w="80"/>
+            </w:tcMar>
+          </w:tcPr>
+          <w:p>
+            <w:pPr>
+              <w:spacing w:after="0" w:line="260"/>
+            </w:pPr>
+            <w:r>
+              <w:rPr>
+                <w:rFonts w:ascii="Calibri" w:cs="Calibri" w:eastAsia="Calibri" w:hAnsi="Calibri"/>
+                <w:b w:val="false"/>
+                <w:bCs w:val="false"/>
+                <w:color w:val="000000"/>
+                <w:sz w:val="20"/>
+                <w:szCs w:val="20"/>
+              </w:rPr>
+              <w:t xml:space="preserve">Execution Accuracy = 0.648 (670/1034); 92.9% of predictions executed</w:t>
+            </w:r>
+          </w:p>
+        </w:tc>
+      </w:tr>
+      <w:tr>
+        <w:tc>
+          <w:tcPr>
+            <w:tcW w:type="dxa" w:w="3026"/>
+            <w:tcMar>
+              <w:top w:type="dxa" w:w="40"/>
+              <w:left w:type="dxa" w:w="80"/>
+              <w:bottom w:type="dxa" w:w="40"/>
+              <w:right w:type="dxa" w:w="80"/>
+            </w:tcMar>
+          </w:tcPr>
+          <w:p>
+            <w:pPr>
+              <w:spacing w:after="0" w:line="260"/>
+            </w:pPr>
+            <w:r>
+              <w:rPr>
+                <w:rFonts w:ascii="Calibri" w:cs="Calibri" w:eastAsia="Calibri" w:hAnsi="Calibri"/>
+                <w:b w:val="false"/>
+                <w:bCs w:val="false"/>
+                <w:color w:val="000000"/>
+                <w:sz w:val="20"/>
+                <w:szCs w:val="20"/>
+              </w:rPr>
+              <w:t xml:space="preserve">decoding / prompt</w:t>
+            </w:r>
+          </w:p>
+        </w:tc>
+        <w:tc>
+          <w:tcPr>
+            <w:tcW w:type="dxa" w:w="6000"/>
+            <w:tcMar>
+              <w:top w:type="dxa" w:w="40"/>
+              <w:left w:type="dxa" w:w="80"/>
+              <w:bottom w:type="dxa" w:w="40"/>
+              <w:right w:type="dxa" w:w="80"/>
+            </w:tcMar>
+          </w:tcPr>
+          <w:p>
+            <w:pPr>
+              <w:spacing w:after="0" w:line="260"/>
+            </w:pPr>
+            <w:r>
+              <w:rPr>
+                <w:rFonts w:ascii="Calibri" w:cs="Calibri" w:eastAsia="Calibri" w:hAnsi="Calibri"/>
+                <w:b w:val="false"/>
+                <w:bCs w:val="false"/>
+                <w:color w:val="000000"/>
+                <w:sz w:val="20"/>
+                <w:szCs w:val="20"/>
+              </w:rPr>
+              <w:t xml:space="preserve">beam search (4); schema + foreign-keys prompt</w:t>
+            </w:r>
+          </w:p>
+        </w:tc>
+      </w:tr>
+      <w:tr>
+        <w:tc>
+          <w:tcPr>
+            <w:tcW w:type="dxa" w:w="3026"/>
+            <w:shd w:fill="EAF0F9" w:color="auto" w:val="clear"/>
+            <w:tcMar>
+              <w:top w:type="dxa" w:w="40"/>
+              <w:left w:type="dxa" w:w="80"/>
+              <w:bottom w:type="dxa" w:w="40"/>
+              <w:right w:type="dxa" w:w="80"/>
+            </w:tcMar>
+          </w:tcPr>
+          <w:p>
+            <w:pPr>
+              <w:spacing w:after="0" w:line="260"/>
+            </w:pPr>
+            <w:r>
+              <w:rPr>
+                <w:rFonts w:ascii="Calibri" w:cs="Calibri" w:eastAsia="Calibri" w:hAnsi="Calibri"/>
+                <w:b w:val="false"/>
+                <w:bCs w:val="false"/>
+                <w:color w:val="000000"/>
+                <w:sz w:val="20"/>
+                <w:szCs w:val="20"/>
+              </w:rPr>
+              <w:t xml:space="preserve">runtime / hardware</w:t>
+            </w:r>
+          </w:p>
+        </w:tc>
+        <w:tc>
+          <w:tcPr>
+            <w:tcW w:type="dxa" w:w="6000"/>
+            <w:shd w:fill="EAF0F9" w:color="auto" w:val="clear"/>
+            <w:tcMar>
+              <w:top w:type="dxa" w:w="40"/>
+              <w:left w:type="dxa" w:w="80"/>
+              <w:bottom w:type="dxa" w:w="40"/>
+              <w:right w:type="dxa" w:w="80"/>
+            </w:tcMar>
+          </w:tcPr>
+          <w:p>
+            <w:pPr>
+              <w:spacing w:after="0" w:line="260"/>
+            </w:pPr>
+            <w:r>
+              <w:rPr>
+                <w:rFonts w:ascii="Calibri" w:cs="Calibri" w:eastAsia="Calibri" w:hAnsi="Calibri"/>
+                <w:b w:val="false"/>
+                <w:bCs w:val="false"/>
+                <w:color w:val="000000"/>
+                <w:sz w:val="20"/>
+                <w:szCs w:val="20"/>
+              </w:rPr>
+              <w:t xml:space="preserve">6,538 s on Apple M4 (MPS), bf16</w:t>
+            </w:r>
+          </w:p>
+        </w:tc>
+      </w:tr>
+      <w:tr>
+        <w:tc>
+          <w:tcPr>
+            <w:tcW w:type="dxa" w:w="3026"/>
+            <w:tcMar>
+              <w:top w:type="dxa" w:w="40"/>
+              <w:left w:type="dxa" w:w="80"/>
+              <w:bottom w:type="dxa" w:w="40"/>
+              <w:right w:type="dxa" w:w="80"/>
+            </w:tcMar>
+          </w:tcPr>
+          <w:p>
+            <w:pPr>
+              <w:spacing w:after="0" w:line="260"/>
+            </w:pPr>
+            <w:r>
+              <w:rPr>
+                <w:rFonts w:ascii="Calibri" w:cs="Calibri" w:eastAsia="Calibri" w:hAnsi="Calibri"/>
+                <w:b w:val="false"/>
+                <w:bCs w:val="false"/>
+                <w:color w:val="000000"/>
+                <w:sz w:val="20"/>
+                <w:szCs w:val="20"/>
+              </w:rPr>
+              <w:t xml:space="preserve">target / tolerance</w:t>
+            </w:r>
+          </w:p>
+        </w:tc>
+        <w:tc>
+          <w:tcPr>
+            <w:tcW w:type="dxa" w:w="6000"/>
+            <w:tcMar>
+              <w:top w:type="dxa" w:w="40"/>
+              <w:left w:type="dxa" w:w="80"/>
+              <w:bottom w:type="dxa" w:w="40"/>
+              <w:right w:type="dxa" w:w="80"/>
+            </w:tcMar>
+          </w:tcPr>
+          <w:p>
+            <w:pPr>
+              <w:spacing w:after="0" w:line="260"/>
+            </w:pPr>
+            <w:r>
+              <w:rPr>
+                <w:rFonts w:ascii="Calibri" w:cs="Calibri" w:eastAsia="Calibri" w:hAnsi="Calibri"/>
+                <w:b w:val="false"/>
+                <w:bCs w:val="false"/>
+                <w:color w:val="000000"/>
+                <w:sz w:val="20"/>
+                <w:szCs w:val="20"/>
+              </w:rPr>
+              <w:t xml:space="preserve">paper 77.9%; outside ±10% (70.1–85.7%) — documented cause: prompt fidelity</w:t>
+            </w:r>
+          </w:p>
+        </w:tc>
+      </w:tr>
+      <w:tr>
+        <w:tc>
+          <w:tcPr>
+            <w:tcW w:type="dxa" w:w="3026"/>
+            <w:shd w:fill="EAF0F9" w:color="auto" w:val="clear"/>
+            <w:tcMar>
+              <w:top w:type="dxa" w:w="40"/>
+              <w:left w:type="dxa" w:w="80"/>
+              <w:bottom w:type="dxa" w:w="40"/>
+              <w:right w:type="dxa" w:w="80"/>
+            </w:tcMar>
+          </w:tcPr>
+          <w:p>
+            <w:pPr>
+              <w:spacing w:after="0" w:line="260"/>
+            </w:pPr>
+            <w:r>
+              <w:rPr>
+                <w:rFonts w:ascii="Calibri" w:cs="Calibri" w:eastAsia="Calibri" w:hAnsi="Calibri"/>
+                <w:b w:val="false"/>
+                <w:bCs w:val="false"/>
+                <w:color w:val="000000"/>
+                <w:sz w:val="20"/>
+                <w:szCs w:val="20"/>
+              </w:rPr>
+              <w:t xml:space="preserve">date</w:t>
+            </w:r>
+          </w:p>
+        </w:tc>
+        <w:tc>
+          <w:tcPr>
+            <w:tcW w:type="dxa" w:w="6000"/>
+            <w:shd w:fill="EAF0F9" w:color="auto" w:val="clear"/>
+            <w:tcMar>
+              <w:top w:type="dxa" w:w="40"/>
+              <w:left w:type="dxa" w:w="80"/>
+              <w:bottom w:type="dxa" w:w="40"/>
+              <w:right w:type="dxa" w:w="80"/>
+            </w:tcMar>
+          </w:tcPr>
+          <w:p>
+            <w:pPr>
+              <w:spacing w:after="0" w:line="260"/>
+            </w:pPr>
+            <w:r>
+              <w:rPr>
+                <w:rFonts w:ascii="Calibri" w:cs="Calibri" w:eastAsia="Calibri" w:hAnsi="Calibri"/>
+                <w:b w:val="false"/>
+                <w:bCs w:val="false"/>
+                <w:color w:val="000000"/>
+                <w:sz w:val="20"/>
+                <w:szCs w:val="20"/>
+              </w:rPr>
+              <w:t xml:space="preserve">2026-08-26</w:t>
             </w:r>
           </w:p>
         </w:tc>

</xml_diff>

<commit_message>
Tier-2 PASSING: faithful CodeS prompt reproduces Spider dev EX 71.7% (within ±10%)
Full 1034-example Spider dev run with the authors' full database prompt (schema +
representative values + question-matched values, T4/Colab): EX = 71.7% (741/1034),
within the SOP ±10% tolerance of the reported 77.9% (~8% relative). Up from 64.8%
with the schema-only prompt — isolating the value retriever as the decisive part.

- reproduction_log: T2-002 logged
- deck slide 6: results table + text updated to 71.7% / within tolerance
- reproducibility report: T2-001 vs T2-002 comparison, residual-gap causes, within-tolerance conclusion
- DELIVERABLES: Month-2 reproduction rows updated

Co-Authored-By: Claude Opus 4.8 <noreply@anthropic.com>
</commit_message>
<xml_diff>
--- a/docs/Code_Reproducibility_Report_v1.docx
+++ b/docs/Code_Reproducibility_Report_v1.docx
@@ -269,7 +269,7 @@
           <w:sz w:val="22"/>
           <w:szCs w:val="22"/>
         </w:rPr>
-        <w:t xml:space="preserve">Summary of status: the released CodeS-1B model has been loaded, has generated valid SQL, and that SQL has executed correctly on both a CUDA GPU (Colab T4) and Apple Silicon (M4). A full local application has been implemented that reproduces the CodeS inference pipeline and adds execution-guided self-correction. The Tier-2 Spider evaluation has been run (inference-only, on the Mac — no CUDA training libraries needed): Execution Accuracy = 64.8% on the full 1,034-example development set. This is below the paper’s 77.9% and outside the ±10% tolerance; the gap is documented and attributed to prompt fidelity (a schema+FK prompt rather than the authors’ full database prompt), with a concrete plan to close it.</w:t>
+        <w:t xml:space="preserve">Summary of status: the released CodeS-1B model has been loaded, has generated valid SQL, and that SQL has executed correctly on both a CUDA GPU (Colab T4) and Apple Silicon (M4). A full local application has been implemented that reproduces the CodeS inference pipeline and adds execution-guided self-correction. The Tier-2 Spider evaluation has been run over the full 1,034-example development set: with a schema-only prompt it reached 64.8% Execution Accuracy, and with the authors’ full database prompt (schema + representative values + question-matched values) it reached 71.7% — within the SOP’s ±10% tolerance of the reported 77.9% (about 8% relative). The reproduction is therefore successful, and the difference between the two runs isolates the value retriever as the decisive component.</w:t>
       </w:r>
     </w:p>
     <w:p>
@@ -3117,7 +3117,469 @@
           <w:sz w:val="22"/>
           <w:szCs w:val="22"/>
         </w:rPr>
-        <w:t xml:space="preserve">Result (run T2-001): Execution Accuracy = 64.8% (670 / 1,034 correct); 92.9% of predicted queries executed without error; wall-clock 6,538 s on an Apple M4 (MPS). This is below the paper’s reported 77.9% and outside the SOP ±10% tolerance band (70.1–85.7%).</w:t>
+        <w:t xml:space="preserve">Two runs were performed over the full 1,034-example development set, differing only in the prompt:</w:t>
+      </w:r>
+    </w:p>
+    <w:tbl>
+      <w:tblPr>
+        <w:tblW w:type="dxa" w:w="9026"/>
+        <w:tblBorders>
+          <w:top w:val="single" w:color="auto" w:sz="4"/>
+          <w:left w:val="single" w:color="auto" w:sz="4"/>
+          <w:bottom w:val="single" w:color="auto" w:sz="4"/>
+          <w:right w:val="single" w:color="auto" w:sz="4"/>
+          <w:insideH w:val="single" w:color="auto" w:sz="4"/>
+          <w:insideV w:val="single" w:color="auto" w:sz="4"/>
+        </w:tblBorders>
+      </w:tblPr>
+      <w:tblGrid>
+        <w:gridCol w:w="1500"/>
+        <w:gridCol w:w="3626"/>
+        <w:gridCol w:w="1200"/>
+        <w:gridCol w:w="1200"/>
+        <w:gridCol w:w="1500"/>
+      </w:tblGrid>
+      <w:tr>
+        <w:trPr>
+          <w:tblHeader/>
+        </w:trPr>
+        <w:tc>
+          <w:tcPr>
+            <w:tcW w:type="dxa" w:w="1500"/>
+            <w:shd w:fill="1F3864" w:color="auto" w:val="clear"/>
+            <w:tcMar>
+              <w:top w:type="dxa" w:w="40"/>
+              <w:left w:type="dxa" w:w="80"/>
+              <w:bottom w:type="dxa" w:w="40"/>
+              <w:right w:type="dxa" w:w="80"/>
+            </w:tcMar>
+          </w:tcPr>
+          <w:p>
+            <w:pPr>
+              <w:spacing w:after="0" w:line="260"/>
+            </w:pPr>
+            <w:r>
+              <w:rPr>
+                <w:rFonts w:ascii="Calibri" w:cs="Calibri" w:eastAsia="Calibri" w:hAnsi="Calibri"/>
+                <w:b/>
+                <w:bCs/>
+                <w:color w:val="FFFFFF"/>
+                <w:sz w:val="20"/>
+                <w:szCs w:val="20"/>
+              </w:rPr>
+              <w:t xml:space="preserve">Run</w:t>
+            </w:r>
+          </w:p>
+        </w:tc>
+        <w:tc>
+          <w:tcPr>
+            <w:tcW w:type="dxa" w:w="3626"/>
+            <w:shd w:fill="1F3864" w:color="auto" w:val="clear"/>
+            <w:tcMar>
+              <w:top w:type="dxa" w:w="40"/>
+              <w:left w:type="dxa" w:w="80"/>
+              <w:bottom w:type="dxa" w:w="40"/>
+              <w:right w:type="dxa" w:w="80"/>
+            </w:tcMar>
+          </w:tcPr>
+          <w:p>
+            <w:pPr>
+              <w:spacing w:after="0" w:line="260"/>
+            </w:pPr>
+            <w:r>
+              <w:rPr>
+                <w:rFonts w:ascii="Calibri" w:cs="Calibri" w:eastAsia="Calibri" w:hAnsi="Calibri"/>
+                <w:b/>
+                <w:bCs/>
+                <w:color w:val="FFFFFF"/>
+                <w:sz w:val="20"/>
+                <w:szCs w:val="20"/>
+              </w:rPr>
+              <w:t xml:space="preserve">Prompt</w:t>
+            </w:r>
+          </w:p>
+        </w:tc>
+        <w:tc>
+          <w:tcPr>
+            <w:tcW w:type="dxa" w:w="1200"/>
+            <w:shd w:fill="1F3864" w:color="auto" w:val="clear"/>
+            <w:tcMar>
+              <w:top w:type="dxa" w:w="40"/>
+              <w:left w:type="dxa" w:w="80"/>
+              <w:bottom w:type="dxa" w:w="40"/>
+              <w:right w:type="dxa" w:w="80"/>
+            </w:tcMar>
+          </w:tcPr>
+          <w:p>
+            <w:pPr>
+              <w:spacing w:after="0" w:line="260"/>
+            </w:pPr>
+            <w:r>
+              <w:rPr>
+                <w:rFonts w:ascii="Calibri" w:cs="Calibri" w:eastAsia="Calibri" w:hAnsi="Calibri"/>
+                <w:b/>
+                <w:bCs/>
+                <w:color w:val="FFFFFF"/>
+                <w:sz w:val="20"/>
+                <w:szCs w:val="20"/>
+              </w:rPr>
+              <w:t xml:space="preserve">EX (%)</w:t>
+            </w:r>
+          </w:p>
+        </w:tc>
+        <w:tc>
+          <w:tcPr>
+            <w:tcW w:type="dxa" w:w="1200"/>
+            <w:shd w:fill="1F3864" w:color="auto" w:val="clear"/>
+            <w:tcMar>
+              <w:top w:type="dxa" w:w="40"/>
+              <w:left w:type="dxa" w:w="80"/>
+              <w:bottom w:type="dxa" w:w="40"/>
+              <w:right w:type="dxa" w:w="80"/>
+            </w:tcMar>
+          </w:tcPr>
+          <w:p>
+            <w:pPr>
+              <w:spacing w:after="0" w:line="260"/>
+            </w:pPr>
+            <w:r>
+              <w:rPr>
+                <w:rFonts w:ascii="Calibri" w:cs="Calibri" w:eastAsia="Calibri" w:hAnsi="Calibri"/>
+                <w:b/>
+                <w:bCs/>
+                <w:color w:val="FFFFFF"/>
+                <w:sz w:val="20"/>
+                <w:szCs w:val="20"/>
+              </w:rPr>
+              <w:t xml:space="preserve">Executes</w:t>
+            </w:r>
+          </w:p>
+        </w:tc>
+        <w:tc>
+          <w:tcPr>
+            <w:tcW w:type="dxa" w:w="1500"/>
+            <w:shd w:fill="1F3864" w:color="auto" w:val="clear"/>
+            <w:tcMar>
+              <w:top w:type="dxa" w:w="40"/>
+              <w:left w:type="dxa" w:w="80"/>
+              <w:bottom w:type="dxa" w:w="40"/>
+              <w:right w:type="dxa" w:w="80"/>
+            </w:tcMar>
+          </w:tcPr>
+          <w:p>
+            <w:pPr>
+              <w:spacing w:after="0" w:line="260"/>
+            </w:pPr>
+            <w:r>
+              <w:rPr>
+                <w:rFonts w:ascii="Calibri" w:cs="Calibri" w:eastAsia="Calibri" w:hAnsi="Calibri"/>
+                <w:b/>
+                <w:bCs/>
+                <w:color w:val="FFFFFF"/>
+                <w:sz w:val="20"/>
+                <w:szCs w:val="20"/>
+              </w:rPr>
+              <w:t xml:space="preserve">vs 77.9% target</w:t>
+            </w:r>
+          </w:p>
+        </w:tc>
+      </w:tr>
+      <w:tr>
+        <w:tc>
+          <w:tcPr>
+            <w:tcW w:type="dxa" w:w="1500"/>
+            <w:tcMar>
+              <w:top w:type="dxa" w:w="40"/>
+              <w:left w:type="dxa" w:w="80"/>
+              <w:bottom w:type="dxa" w:w="40"/>
+              <w:right w:type="dxa" w:w="80"/>
+            </w:tcMar>
+          </w:tcPr>
+          <w:p>
+            <w:pPr>
+              <w:spacing w:after="0" w:line="260"/>
+            </w:pPr>
+            <w:r>
+              <w:rPr>
+                <w:rFonts w:ascii="Calibri" w:cs="Calibri" w:eastAsia="Calibri" w:hAnsi="Calibri"/>
+                <w:b w:val="false"/>
+                <w:bCs w:val="false"/>
+                <w:color w:val="000000"/>
+                <w:sz w:val="20"/>
+                <w:szCs w:val="20"/>
+              </w:rPr>
+              <w:t xml:space="preserve">T2-001</w:t>
+            </w:r>
+          </w:p>
+        </w:tc>
+        <w:tc>
+          <w:tcPr>
+            <w:tcW w:type="dxa" w:w="3626"/>
+            <w:tcMar>
+              <w:top w:type="dxa" w:w="40"/>
+              <w:left w:type="dxa" w:w="80"/>
+              <w:bottom w:type="dxa" w:w="40"/>
+              <w:right w:type="dxa" w:w="80"/>
+            </w:tcMar>
+          </w:tcPr>
+          <w:p>
+            <w:pPr>
+              <w:spacing w:after="0" w:line="260"/>
+            </w:pPr>
+            <w:r>
+              <w:rPr>
+                <w:rFonts w:ascii="Calibri" w:cs="Calibri" w:eastAsia="Calibri" w:hAnsi="Calibri"/>
+                <w:b w:val="false"/>
+                <w:bCs w:val="false"/>
+                <w:color w:val="000000"/>
+                <w:sz w:val="20"/>
+                <w:szCs w:val="20"/>
+              </w:rPr>
+              <w:t xml:space="preserve">schema + foreign keys only</w:t>
+            </w:r>
+          </w:p>
+        </w:tc>
+        <w:tc>
+          <w:tcPr>
+            <w:tcW w:type="dxa" w:w="1200"/>
+            <w:tcMar>
+              <w:top w:type="dxa" w:w="40"/>
+              <w:left w:type="dxa" w:w="80"/>
+              <w:bottom w:type="dxa" w:w="40"/>
+              <w:right w:type="dxa" w:w="80"/>
+            </w:tcMar>
+          </w:tcPr>
+          <w:p>
+            <w:pPr>
+              <w:spacing w:after="0" w:line="260"/>
+            </w:pPr>
+            <w:r>
+              <w:rPr>
+                <w:rFonts w:ascii="Calibri" w:cs="Calibri" w:eastAsia="Calibri" w:hAnsi="Calibri"/>
+                <w:b w:val="false"/>
+                <w:bCs w:val="false"/>
+                <w:color w:val="000000"/>
+                <w:sz w:val="20"/>
+                <w:szCs w:val="20"/>
+              </w:rPr>
+              <w:t xml:space="preserve">64.8</w:t>
+            </w:r>
+          </w:p>
+        </w:tc>
+        <w:tc>
+          <w:tcPr>
+            <w:tcW w:type="dxa" w:w="1200"/>
+            <w:tcMar>
+              <w:top w:type="dxa" w:w="40"/>
+              <w:left w:type="dxa" w:w="80"/>
+              <w:bottom w:type="dxa" w:w="40"/>
+              <w:right w:type="dxa" w:w="80"/>
+            </w:tcMar>
+          </w:tcPr>
+          <w:p>
+            <w:pPr>
+              <w:spacing w:after="0" w:line="260"/>
+            </w:pPr>
+            <w:r>
+              <w:rPr>
+                <w:rFonts w:ascii="Calibri" w:cs="Calibri" w:eastAsia="Calibri" w:hAnsi="Calibri"/>
+                <w:b w:val="false"/>
+                <w:bCs w:val="false"/>
+                <w:color w:val="000000"/>
+                <w:sz w:val="20"/>
+                <w:szCs w:val="20"/>
+              </w:rPr>
+              <w:t xml:space="preserve">92.9%</w:t>
+            </w:r>
+          </w:p>
+        </w:tc>
+        <w:tc>
+          <w:tcPr>
+            <w:tcW w:type="dxa" w:w="1500"/>
+            <w:tcMar>
+              <w:top w:type="dxa" w:w="40"/>
+              <w:left w:type="dxa" w:w="80"/>
+              <w:bottom w:type="dxa" w:w="40"/>
+              <w:right w:type="dxa" w:w="80"/>
+            </w:tcMar>
+          </w:tcPr>
+          <w:p>
+            <w:pPr>
+              <w:spacing w:after="0" w:line="260"/>
+            </w:pPr>
+            <w:r>
+              <w:rPr>
+                <w:rFonts w:ascii="Calibri" w:cs="Calibri" w:eastAsia="Calibri" w:hAnsi="Calibri"/>
+                <w:b w:val="false"/>
+                <w:bCs w:val="false"/>
+                <w:color w:val="000000"/>
+                <w:sz w:val="20"/>
+                <w:szCs w:val="20"/>
+              </w:rPr>
+              <w:t xml:space="preserve">outside ±10%</w:t>
+            </w:r>
+          </w:p>
+        </w:tc>
+      </w:tr>
+      <w:tr>
+        <w:tc>
+          <w:tcPr>
+            <w:tcW w:type="dxa" w:w="1500"/>
+            <w:shd w:fill="EAF0F9" w:color="auto" w:val="clear"/>
+            <w:tcMar>
+              <w:top w:type="dxa" w:w="40"/>
+              <w:left w:type="dxa" w:w="80"/>
+              <w:bottom w:type="dxa" w:w="40"/>
+              <w:right w:type="dxa" w:w="80"/>
+            </w:tcMar>
+          </w:tcPr>
+          <w:p>
+            <w:pPr>
+              <w:spacing w:after="0" w:line="260"/>
+            </w:pPr>
+            <w:r>
+              <w:rPr>
+                <w:rFonts w:ascii="Calibri" w:cs="Calibri" w:eastAsia="Calibri" w:hAnsi="Calibri"/>
+                <w:b w:val="false"/>
+                <w:bCs w:val="false"/>
+                <w:color w:val="000000"/>
+                <w:sz w:val="20"/>
+                <w:szCs w:val="20"/>
+              </w:rPr>
+              <w:t xml:space="preserve">T2-002</w:t>
+            </w:r>
+          </w:p>
+        </w:tc>
+        <w:tc>
+          <w:tcPr>
+            <w:tcW w:type="dxa" w:w="3626"/>
+            <w:shd w:fill="EAF0F9" w:color="auto" w:val="clear"/>
+            <w:tcMar>
+              <w:top w:type="dxa" w:w="40"/>
+              <w:left w:type="dxa" w:w="80"/>
+              <w:bottom w:type="dxa" w:w="40"/>
+              <w:right w:type="dxa" w:w="80"/>
+            </w:tcMar>
+          </w:tcPr>
+          <w:p>
+            <w:pPr>
+              <w:spacing w:after="0" w:line="260"/>
+            </w:pPr>
+            <w:r>
+              <w:rPr>
+                <w:rFonts w:ascii="Calibri" w:cs="Calibri" w:eastAsia="Calibri" w:hAnsi="Calibri"/>
+                <w:b w:val="false"/>
+                <w:bCs w:val="false"/>
+                <w:color w:val="000000"/>
+                <w:sz w:val="20"/>
+                <w:szCs w:val="20"/>
+              </w:rPr>
+              <w:t xml:space="preserve">full CodeS prompt (schema + values + matched contents)</w:t>
+            </w:r>
+          </w:p>
+        </w:tc>
+        <w:tc>
+          <w:tcPr>
+            <w:tcW w:type="dxa" w:w="1200"/>
+            <w:shd w:fill="EAF0F9" w:color="auto" w:val="clear"/>
+            <w:tcMar>
+              <w:top w:type="dxa" w:w="40"/>
+              <w:left w:type="dxa" w:w="80"/>
+              <w:bottom w:type="dxa" w:w="40"/>
+              <w:right w:type="dxa" w:w="80"/>
+            </w:tcMar>
+          </w:tcPr>
+          <w:p>
+            <w:pPr>
+              <w:spacing w:after="0" w:line="260"/>
+            </w:pPr>
+            <w:r>
+              <w:rPr>
+                <w:rFonts w:ascii="Calibri" w:cs="Calibri" w:eastAsia="Calibri" w:hAnsi="Calibri"/>
+                <w:b w:val="false"/>
+                <w:bCs w:val="false"/>
+                <w:color w:val="000000"/>
+                <w:sz w:val="20"/>
+                <w:szCs w:val="20"/>
+              </w:rPr>
+              <w:t xml:space="preserve">71.7</w:t>
+            </w:r>
+          </w:p>
+        </w:tc>
+        <w:tc>
+          <w:tcPr>
+            <w:tcW w:type="dxa" w:w="1200"/>
+            <w:shd w:fill="EAF0F9" w:color="auto" w:val="clear"/>
+            <w:tcMar>
+              <w:top w:type="dxa" w:w="40"/>
+              <w:left w:type="dxa" w:w="80"/>
+              <w:bottom w:type="dxa" w:w="40"/>
+              <w:right w:type="dxa" w:w="80"/>
+            </w:tcMar>
+          </w:tcPr>
+          <w:p>
+            <w:pPr>
+              <w:spacing w:after="0" w:line="260"/>
+            </w:pPr>
+            <w:r>
+              <w:rPr>
+                <w:rFonts w:ascii="Calibri" w:cs="Calibri" w:eastAsia="Calibri" w:hAnsi="Calibri"/>
+                <w:b w:val="false"/>
+                <w:bCs w:val="false"/>
+                <w:color w:val="000000"/>
+                <w:sz w:val="20"/>
+                <w:szCs w:val="20"/>
+              </w:rPr>
+              <w:t xml:space="preserve">93.5%</w:t>
+            </w:r>
+          </w:p>
+        </w:tc>
+        <w:tc>
+          <w:tcPr>
+            <w:tcW w:type="dxa" w:w="1500"/>
+            <w:shd w:fill="EAF0F9" w:color="auto" w:val="clear"/>
+            <w:tcMar>
+              <w:top w:type="dxa" w:w="40"/>
+              <w:left w:type="dxa" w:w="80"/>
+              <w:bottom w:type="dxa" w:w="40"/>
+              <w:right w:type="dxa" w:w="80"/>
+            </w:tcMar>
+          </w:tcPr>
+          <w:p>
+            <w:pPr>
+              <w:spacing w:after="0" w:line="260"/>
+            </w:pPr>
+            <w:r>
+              <w:rPr>
+                <w:rFonts w:ascii="Calibri" w:cs="Calibri" w:eastAsia="Calibri" w:hAnsi="Calibri"/>
+                <w:b w:val="false"/>
+                <w:bCs w:val="false"/>
+                <w:color w:val="000000"/>
+                <w:sz w:val="20"/>
+                <w:szCs w:val="20"/>
+              </w:rPr>
+              <w:t xml:space="preserve">within ±10% (~8% rel.)</w:t>
+            </w:r>
+          </w:p>
+        </w:tc>
+      </w:tr>
+    </w:tbl>
+    <w:p>
+      <w:pPr>
+        <w:spacing w:after="80"/>
+      </w:pPr>
+    </w:p>
+    <w:p>
+      <w:pPr>
+        <w:spacing w:after="120" w:line="276"/>
+      </w:pPr>
+      <w:r>
+        <w:rPr>
+          <w:rFonts w:ascii="Calibri" w:cs="Calibri" w:eastAsia="Calibri" w:hAnsi="Calibri"/>
+          <w:sz w:val="22"/>
+          <w:szCs w:val="22"/>
+        </w:rPr>
+        <w:t xml:space="preserve">The reproduction target of 77.9% is met within the SOP’s ±10% tolerance by run T2-002 (71.7%). The 6.9-point jump from T2-001 to T2-002 isolates the value retriever as the decisive component: the seeklhy/codes-1b-spider checkpoint was fine-tuned on prompts that include cell values matched to the question, so supplying them restores the context the model expects (especially for WHERE predicates).</w:t>
       </w:r>
     </w:p>
     <w:p>
@@ -3134,12 +3596,17 @@
           <w:sz w:val="25"/>
           <w:szCs w:val="25"/>
         </w:rPr>
-        <w:t xml:space="preserve">6.1 Documented cause of the gap</w:t>
-      </w:r>
-    </w:p>
-    <w:p>
-      <w:pPr>
-        <w:spacing w:after="120" w:line="276"/>
+        <w:t xml:space="preserve">6.1 Documented causes of the residual ~8% difference</w:t>
+      </w:r>
+    </w:p>
+    <w:p>
+      <w:pPr>
+        <w:pStyle w:val="ListParagraph"/>
+        <w:numPr>
+          <w:ilvl w:val="0"/>
+          <w:numId w:val="1"/>
+        </w:numPr>
+        <w:spacing w:after="60" w:line="276"/>
       </w:pPr>
       <w:r>
         <w:rPr>
@@ -3147,7 +3614,43 @@
           <w:sz w:val="22"/>
           <w:szCs w:val="22"/>
         </w:rPr>
-        <w:t xml:space="preserve">The −13.1-point gap is attributed primarily to prompt fidelity. The seeklhy/codes-1b-spider checkpoint was fine-tuned on the authors’ full database prompt — schema-filtered tables and columns, cell values matched by the BM25 + LCS value retriever, and metadata (column types, comments, representative values, primary/foreign keys). This reproduction fed a simpler prompt (schema + foreign keys only), so the model receives less of the context it was trained to use, which especially harms predicates that depend on matched cell values. A secondary factor is that Execution Accuracy here is computed by result-set comparison rather than the official test-suite script. Both are legitimate documented deviations rather than defects to conceal.</w:t>
+        <w:t xml:space="preserve">Value retriever: we approximate the authors’ Lucene BM25 coarse step with a direct distinct-value scan, then apply their exact fine matcher (get_matched_entries, score ≥ 0.9). Coverage is close but not identical.</w:t>
+      </w:r>
+    </w:p>
+    <w:p>
+      <w:pPr>
+        <w:pStyle w:val="ListParagraph"/>
+        <w:numPr>
+          <w:ilvl w:val="0"/>
+          <w:numId w:val="1"/>
+        </w:numPr>
+        <w:spacing w:after="60" w:line="276"/>
+      </w:pPr>
+      <w:r>
+        <w:rPr>
+          <w:rFonts w:ascii="Calibri" w:cs="Calibri" w:eastAsia="Calibri" w:hAnsi="Calibri"/>
+          <w:sz w:val="22"/>
+          <w:szCs w:val="22"/>
+        </w:rPr>
+        <w:t xml:space="preserve">Metric: Execution Accuracy is computed by result-set comparison rather than the official Spider test-suite script, which can differ on ordering and duplicate handling.</w:t>
+      </w:r>
+    </w:p>
+    <w:p>
+      <w:pPr>
+        <w:pStyle w:val="ListParagraph"/>
+        <w:numPr>
+          <w:ilvl w:val="0"/>
+          <w:numId w:val="1"/>
+        </w:numPr>
+        <w:spacing w:after="60" w:line="276"/>
+      </w:pPr>
+      <w:r>
+        <w:rPr>
+          <w:rFonts w:ascii="Calibri" w:cs="Calibri" w:eastAsia="Calibri" w:hAnsi="Calibri"/>
+          <w:sz w:val="22"/>
+          <w:szCs w:val="22"/>
+        </w:rPr>
+        <w:t xml:space="preserve">Schema filter: we pass the full schema rather than the learned top-k schema-item classifier (acceptable on Spider’s small databases).</w:t>
       </w:r>
     </w:p>
     <w:p>
@@ -3164,7 +3667,7 @@
           <w:sz w:val="25"/>
           <w:szCs w:val="25"/>
         </w:rPr>
-        <w:t xml:space="preserve">6.2 Planned improvement and remaining runs</w:t>
+        <w:t xml:space="preserve">6.2 Remaining runs</w:t>
       </w:r>
     </w:p>
     <w:p>
@@ -3177,7 +3680,7 @@
           <w:sz w:val="22"/>
           <w:szCs w:val="22"/>
         </w:rPr>
-        <w:t xml:space="preserve">To close the gap toward 77.9%, the next step is to construct the authors’ full database prompt (schema filter + value retriever + metadata) using the released sic_ckpts and a per-database BM25 index, and to adopt the official test-suite evaluation. Two further runs will then be logged to complete the three-run Week-5 requirement (beam search is deterministic, so runs vary only by documented configuration changes rather than by random seed).</w:t>
+        <w:t xml:space="preserve">Two further logged runs will complete the three-run Week-5 requirement, and the official test-suite script will be adopted for TS. Beam search is deterministic, so runs vary by documented configuration rather than random seed.</w:t>
       </w:r>
     </w:p>
     <w:p>
@@ -6686,7 +7189,7 @@
           <w:sz w:val="25"/>
           <w:szCs w:val="25"/>
         </w:rPr>
-        <w:t xml:space="preserve">Appendix A.1 — Tier-2 run (T2-001)</w:t>
+        <w:t xml:space="preserve">Appendix A.1 — Tier-2 runs</w:t>
       </w:r>
     </w:p>
     <w:tbl>
@@ -6702,8 +7205,9 @@
         </w:tblBorders>
       </w:tblPr>
       <w:tblGrid>
+        <w:gridCol w:w="1900"/>
+        <w:gridCol w:w="4100"/>
         <w:gridCol w:w="3026"/>
-        <w:gridCol w:w="6000"/>
       </w:tblGrid>
       <w:tr>
         <w:trPr>
@@ -6711,7 +7215,7 @@
         </w:trPr>
         <w:tc>
           <w:tcPr>
-            <w:tcW w:type="dxa" w:w="3026"/>
+            <w:tcW w:type="dxa" w:w="1900"/>
             <w:shd w:fill="1F3864" w:color="auto" w:val="clear"/>
             <w:tcMar>
               <w:top w:type="dxa" w:w="40"/>
@@ -6739,7 +7243,7 @@
         </w:tc>
         <w:tc>
           <w:tcPr>
-            <w:tcW w:type="dxa" w:w="6000"/>
+            <w:tcW w:type="dxa" w:w="4100"/>
             <w:shd w:fill="1F3864" w:color="auto" w:val="clear"/>
             <w:tcMar>
               <w:top w:type="dxa" w:w="40"/>
@@ -6761,7 +7265,35 @@
                 <w:sz w:val="20"/>
                 <w:szCs w:val="20"/>
               </w:rPr>
-              <w:t xml:space="preserve">Value</w:t>
+              <w:t xml:space="preserve">T2-002 (headline)</w:t>
+            </w:r>
+          </w:p>
+        </w:tc>
+        <w:tc>
+          <w:tcPr>
+            <w:tcW w:type="dxa" w:w="3026"/>
+            <w:shd w:fill="1F3864" w:color="auto" w:val="clear"/>
+            <w:tcMar>
+              <w:top w:type="dxa" w:w="40"/>
+              <w:left w:type="dxa" w:w="80"/>
+              <w:bottom w:type="dxa" w:w="40"/>
+              <w:right w:type="dxa" w:w="80"/>
+            </w:tcMar>
+          </w:tcPr>
+          <w:p>
+            <w:pPr>
+              <w:spacing w:after="0" w:line="260"/>
+            </w:pPr>
+            <w:r>
+              <w:rPr>
+                <w:rFonts w:ascii="Calibri" w:cs="Calibri" w:eastAsia="Calibri" w:hAnsi="Calibri"/>
+                <w:b/>
+                <w:bCs/>
+                <w:color w:val="FFFFFF"/>
+                <w:sz w:val="20"/>
+                <w:szCs w:val="20"/>
+              </w:rPr>
+              <w:t xml:space="preserve">T2-001</w:t>
             </w:r>
           </w:p>
         </w:tc>
@@ -6769,6 +7301,60 @@
       <w:tr>
         <w:tc>
           <w:tcPr>
+            <w:tcW w:type="dxa" w:w="1900"/>
+            <w:tcMar>
+              <w:top w:type="dxa" w:w="40"/>
+              <w:left w:type="dxa" w:w="80"/>
+              <w:bottom w:type="dxa" w:w="40"/>
+              <w:right w:type="dxa" w:w="80"/>
+            </w:tcMar>
+          </w:tcPr>
+          <w:p>
+            <w:pPr>
+              <w:spacing w:after="0" w:line="260"/>
+            </w:pPr>
+            <w:r>
+              <w:rPr>
+                <w:rFonts w:ascii="Calibri" w:cs="Calibri" w:eastAsia="Calibri" w:hAnsi="Calibri"/>
+                <w:b w:val="false"/>
+                <w:bCs w:val="false"/>
+                <w:color w:val="000000"/>
+                <w:sz w:val="20"/>
+                <w:szCs w:val="20"/>
+              </w:rPr>
+              <w:t xml:space="preserve">model</w:t>
+            </w:r>
+          </w:p>
+        </w:tc>
+        <w:tc>
+          <w:tcPr>
+            <w:tcW w:type="dxa" w:w="4100"/>
+            <w:tcMar>
+              <w:top w:type="dxa" w:w="40"/>
+              <w:left w:type="dxa" w:w="80"/>
+              <w:bottom w:type="dxa" w:w="40"/>
+              <w:right w:type="dxa" w:w="80"/>
+            </w:tcMar>
+          </w:tcPr>
+          <w:p>
+            <w:pPr>
+              <w:spacing w:after="0" w:line="260"/>
+            </w:pPr>
+            <w:r>
+              <w:rPr>
+                <w:rFonts w:ascii="Calibri" w:cs="Calibri" w:eastAsia="Calibri" w:hAnsi="Calibri"/>
+                <w:b w:val="false"/>
+                <w:bCs w:val="false"/>
+                <w:color w:val="000000"/>
+                <w:sz w:val="20"/>
+                <w:szCs w:val="20"/>
+              </w:rPr>
+              <w:t xml:space="preserve">seeklhy/codes-1b-spider (SFT)</w:t>
+            </w:r>
+          </w:p>
+        </w:tc>
+        <w:tc>
+          <w:tcPr>
             <w:tcW w:type="dxa" w:w="3026"/>
             <w:tcMar>
               <w:top w:type="dxa" w:w="40"/>
@@ -6790,34 +7376,7 @@
                 <w:sz w:val="20"/>
                 <w:szCs w:val="20"/>
               </w:rPr>
-              <w:t xml:space="preserve">run_id</w:t>
-            </w:r>
-          </w:p>
-        </w:tc>
-        <w:tc>
-          <w:tcPr>
-            <w:tcW w:type="dxa" w:w="6000"/>
-            <w:tcMar>
-              <w:top w:type="dxa" w:w="40"/>
-              <w:left w:type="dxa" w:w="80"/>
-              <w:bottom w:type="dxa" w:w="40"/>
-              <w:right w:type="dxa" w:w="80"/>
-            </w:tcMar>
-          </w:tcPr>
-          <w:p>
-            <w:pPr>
-              <w:spacing w:after="0" w:line="260"/>
-            </w:pPr>
-            <w:r>
-              <w:rPr>
-                <w:rFonts w:ascii="Calibri" w:cs="Calibri" w:eastAsia="Calibri" w:hAnsi="Calibri"/>
-                <w:b w:val="false"/>
-                <w:bCs w:val="false"/>
-                <w:color w:val="000000"/>
-                <w:sz w:val="20"/>
-                <w:szCs w:val="20"/>
-              </w:rPr>
-              <w:t xml:space="preserve">T2-001</w:t>
+              <w:t xml:space="preserve">same</w:t>
             </w:r>
           </w:p>
         </w:tc>
@@ -6825,6 +7384,62 @@
       <w:tr>
         <w:tc>
           <w:tcPr>
+            <w:tcW w:type="dxa" w:w="1900"/>
+            <w:shd w:fill="EAF0F9" w:color="auto" w:val="clear"/>
+            <w:tcMar>
+              <w:top w:type="dxa" w:w="40"/>
+              <w:left w:type="dxa" w:w="80"/>
+              <w:bottom w:type="dxa" w:w="40"/>
+              <w:right w:type="dxa" w:w="80"/>
+            </w:tcMar>
+          </w:tcPr>
+          <w:p>
+            <w:pPr>
+              <w:spacing w:after="0" w:line="260"/>
+            </w:pPr>
+            <w:r>
+              <w:rPr>
+                <w:rFonts w:ascii="Calibri" w:cs="Calibri" w:eastAsia="Calibri" w:hAnsi="Calibri"/>
+                <w:b w:val="false"/>
+                <w:bCs w:val="false"/>
+                <w:color w:val="000000"/>
+                <w:sz w:val="20"/>
+                <w:szCs w:val="20"/>
+              </w:rPr>
+              <w:t xml:space="preserve">dataset</w:t>
+            </w:r>
+          </w:p>
+        </w:tc>
+        <w:tc>
+          <w:tcPr>
+            <w:tcW w:type="dxa" w:w="4100"/>
+            <w:shd w:fill="EAF0F9" w:color="auto" w:val="clear"/>
+            <w:tcMar>
+              <w:top w:type="dxa" w:w="40"/>
+              <w:left w:type="dxa" w:w="80"/>
+              <w:bottom w:type="dxa" w:w="40"/>
+              <w:right w:type="dxa" w:w="80"/>
+            </w:tcMar>
+          </w:tcPr>
+          <w:p>
+            <w:pPr>
+              <w:spacing w:after="0" w:line="260"/>
+            </w:pPr>
+            <w:r>
+              <w:rPr>
+                <w:rFonts w:ascii="Calibri" w:cs="Calibri" w:eastAsia="Calibri" w:hAnsi="Calibri"/>
+                <w:b w:val="false"/>
+                <w:bCs w:val="false"/>
+                <w:color w:val="000000"/>
+                <w:sz w:val="20"/>
+                <w:szCs w:val="20"/>
+              </w:rPr>
+              <w:t xml:space="preserve">Spider dev — 1,034</w:t>
+            </w:r>
+          </w:p>
+        </w:tc>
+        <w:tc>
+          <w:tcPr>
             <w:tcW w:type="dxa" w:w="3026"/>
             <w:shd w:fill="EAF0F9" w:color="auto" w:val="clear"/>
             <w:tcMar>
@@ -6847,35 +7462,7 @@
                 <w:sz w:val="20"/>
                 <w:szCs w:val="20"/>
               </w:rPr>
-              <w:t xml:space="preserve">model</w:t>
-            </w:r>
-          </w:p>
-        </w:tc>
-        <w:tc>
-          <w:tcPr>
-            <w:tcW w:type="dxa" w:w="6000"/>
-            <w:shd w:fill="EAF0F9" w:color="auto" w:val="clear"/>
-            <w:tcMar>
-              <w:top w:type="dxa" w:w="40"/>
-              <w:left w:type="dxa" w:w="80"/>
-              <w:bottom w:type="dxa" w:w="40"/>
-              <w:right w:type="dxa" w:w="80"/>
-            </w:tcMar>
-          </w:tcPr>
-          <w:p>
-            <w:pPr>
-              <w:spacing w:after="0" w:line="260"/>
-            </w:pPr>
-            <w:r>
-              <w:rPr>
-                <w:rFonts w:ascii="Calibri" w:cs="Calibri" w:eastAsia="Calibri" w:hAnsi="Calibri"/>
-                <w:b w:val="false"/>
-                <w:bCs w:val="false"/>
-                <w:color w:val="000000"/>
-                <w:sz w:val="20"/>
-                <w:szCs w:val="20"/>
-              </w:rPr>
-              <w:t xml:space="preserve">seeklhy/codes-1b-spider (SFT)</w:t>
+              <w:t xml:space="preserve">Spider dev — 1,034</w:t>
             </w:r>
           </w:p>
         </w:tc>
@@ -6883,6 +7470,60 @@
       <w:tr>
         <w:tc>
           <w:tcPr>
+            <w:tcW w:type="dxa" w:w="1900"/>
+            <w:tcMar>
+              <w:top w:type="dxa" w:w="40"/>
+              <w:left w:type="dxa" w:w="80"/>
+              <w:bottom w:type="dxa" w:w="40"/>
+              <w:right w:type="dxa" w:w="80"/>
+            </w:tcMar>
+          </w:tcPr>
+          <w:p>
+            <w:pPr>
+              <w:spacing w:after="0" w:line="260"/>
+            </w:pPr>
+            <w:r>
+              <w:rPr>
+                <w:rFonts w:ascii="Calibri" w:cs="Calibri" w:eastAsia="Calibri" w:hAnsi="Calibri"/>
+                <w:b w:val="false"/>
+                <w:bCs w:val="false"/>
+                <w:color w:val="000000"/>
+                <w:sz w:val="20"/>
+                <w:szCs w:val="20"/>
+              </w:rPr>
+              <w:t xml:space="preserve">prompt</w:t>
+            </w:r>
+          </w:p>
+        </w:tc>
+        <w:tc>
+          <w:tcPr>
+            <w:tcW w:type="dxa" w:w="4100"/>
+            <w:tcMar>
+              <w:top w:type="dxa" w:w="40"/>
+              <w:left w:type="dxa" w:w="80"/>
+              <w:bottom w:type="dxa" w:w="40"/>
+              <w:right w:type="dxa" w:w="80"/>
+            </w:tcMar>
+          </w:tcPr>
+          <w:p>
+            <w:pPr>
+              <w:spacing w:after="0" w:line="260"/>
+            </w:pPr>
+            <w:r>
+              <w:rPr>
+                <w:rFonts w:ascii="Calibri" w:cs="Calibri" w:eastAsia="Calibri" w:hAnsi="Calibri"/>
+                <w:b w:val="false"/>
+                <w:bCs w:val="false"/>
+                <w:color w:val="000000"/>
+                <w:sz w:val="20"/>
+                <w:szCs w:val="20"/>
+              </w:rPr>
+              <w:t xml:space="preserve">full CodeS prompt (schema+values+matched)</w:t>
+            </w:r>
+          </w:p>
+        </w:tc>
+        <w:tc>
+          <w:tcPr>
             <w:tcW w:type="dxa" w:w="3026"/>
             <w:tcMar>
               <w:top w:type="dxa" w:w="40"/>
@@ -6904,34 +7545,7 @@
                 <w:sz w:val="20"/>
                 <w:szCs w:val="20"/>
               </w:rPr>
-              <w:t xml:space="preserve">dataset</w:t>
-            </w:r>
-          </w:p>
-        </w:tc>
-        <w:tc>
-          <w:tcPr>
-            <w:tcW w:type="dxa" w:w="6000"/>
-            <w:tcMar>
-              <w:top w:type="dxa" w:w="40"/>
-              <w:left w:type="dxa" w:w="80"/>
-              <w:bottom w:type="dxa" w:w="40"/>
-              <w:right w:type="dxa" w:w="80"/>
-            </w:tcMar>
-          </w:tcPr>
-          <w:p>
-            <w:pPr>
-              <w:spacing w:after="0" w:line="260"/>
-            </w:pPr>
-            <w:r>
-              <w:rPr>
-                <w:rFonts w:ascii="Calibri" w:cs="Calibri" w:eastAsia="Calibri" w:hAnsi="Calibri"/>
-                <w:b w:val="false"/>
-                <w:bCs w:val="false"/>
-                <w:color w:val="000000"/>
-                <w:sz w:val="20"/>
-                <w:szCs w:val="20"/>
-              </w:rPr>
-              <w:t xml:space="preserve">Spider dev — full 1,034 examples</w:t>
+              <w:t xml:space="preserve">schema + foreign keys</w:t>
             </w:r>
           </w:p>
         </w:tc>
@@ -6939,6 +7553,62 @@
       <w:tr>
         <w:tc>
           <w:tcPr>
+            <w:tcW w:type="dxa" w:w="1900"/>
+            <w:shd w:fill="EAF0F9" w:color="auto" w:val="clear"/>
+            <w:tcMar>
+              <w:top w:type="dxa" w:w="40"/>
+              <w:left w:type="dxa" w:w="80"/>
+              <w:bottom w:type="dxa" w:w="40"/>
+              <w:right w:type="dxa" w:w="80"/>
+            </w:tcMar>
+          </w:tcPr>
+          <w:p>
+            <w:pPr>
+              <w:spacing w:after="0" w:line="260"/>
+            </w:pPr>
+            <w:r>
+              <w:rPr>
+                <w:rFonts w:ascii="Calibri" w:cs="Calibri" w:eastAsia="Calibri" w:hAnsi="Calibri"/>
+                <w:b w:val="false"/>
+                <w:bCs w:val="false"/>
+                <w:color w:val="000000"/>
+                <w:sz w:val="20"/>
+                <w:szCs w:val="20"/>
+              </w:rPr>
+              <w:t xml:space="preserve">EX</w:t>
+            </w:r>
+          </w:p>
+        </w:tc>
+        <w:tc>
+          <w:tcPr>
+            <w:tcW w:type="dxa" w:w="4100"/>
+            <w:shd w:fill="EAF0F9" w:color="auto" w:val="clear"/>
+            <w:tcMar>
+              <w:top w:type="dxa" w:w="40"/>
+              <w:left w:type="dxa" w:w="80"/>
+              <w:bottom w:type="dxa" w:w="40"/>
+              <w:right w:type="dxa" w:w="80"/>
+            </w:tcMar>
+          </w:tcPr>
+          <w:p>
+            <w:pPr>
+              <w:spacing w:after="0" w:line="260"/>
+            </w:pPr>
+            <w:r>
+              <w:rPr>
+                <w:rFonts w:ascii="Calibri" w:cs="Calibri" w:eastAsia="Calibri" w:hAnsi="Calibri"/>
+                <w:b w:val="false"/>
+                <w:bCs w:val="false"/>
+                <w:color w:val="000000"/>
+                <w:sz w:val="20"/>
+                <w:szCs w:val="20"/>
+              </w:rPr>
+              <w:t xml:space="preserve">0.7166 (741/1034)</w:t>
+            </w:r>
+          </w:p>
+        </w:tc>
+        <w:tc>
+          <w:tcPr>
             <w:tcW w:type="dxa" w:w="3026"/>
             <w:shd w:fill="EAF0F9" w:color="auto" w:val="clear"/>
             <w:tcMar>
@@ -6961,35 +7631,7 @@
                 <w:sz w:val="20"/>
                 <w:szCs w:val="20"/>
               </w:rPr>
-              <w:t xml:space="preserve">metric</w:t>
-            </w:r>
-          </w:p>
-        </w:tc>
-        <w:tc>
-          <w:tcPr>
-            <w:tcW w:type="dxa" w:w="6000"/>
-            <w:shd w:fill="EAF0F9" w:color="auto" w:val="clear"/>
-            <w:tcMar>
-              <w:top w:type="dxa" w:w="40"/>
-              <w:left w:type="dxa" w:w="80"/>
-              <w:bottom w:type="dxa" w:w="40"/>
-              <w:right w:type="dxa" w:w="80"/>
-            </w:tcMar>
-          </w:tcPr>
-          <w:p>
-            <w:pPr>
-              <w:spacing w:after="0" w:line="260"/>
-            </w:pPr>
-            <w:r>
-              <w:rPr>
-                <w:rFonts w:ascii="Calibri" w:cs="Calibri" w:eastAsia="Calibri" w:hAnsi="Calibri"/>
-                <w:b w:val="false"/>
-                <w:bCs w:val="false"/>
-                <w:color w:val="000000"/>
-                <w:sz w:val="20"/>
-                <w:szCs w:val="20"/>
-              </w:rPr>
-              <w:t xml:space="preserve">Execution Accuracy = 0.648 (670/1034); 92.9% of predictions executed</w:t>
+              <w:t xml:space="preserve">0.648 (670/1034)</w:t>
             </w:r>
           </w:p>
         </w:tc>
@@ -6997,6 +7639,60 @@
       <w:tr>
         <w:tc>
           <w:tcPr>
+            <w:tcW w:type="dxa" w:w="1900"/>
+            <w:tcMar>
+              <w:top w:type="dxa" w:w="40"/>
+              <w:left w:type="dxa" w:w="80"/>
+              <w:bottom w:type="dxa" w:w="40"/>
+              <w:right w:type="dxa" w:w="80"/>
+            </w:tcMar>
+          </w:tcPr>
+          <w:p>
+            <w:pPr>
+              <w:spacing w:after="0" w:line="260"/>
+            </w:pPr>
+            <w:r>
+              <w:rPr>
+                <w:rFonts w:ascii="Calibri" w:cs="Calibri" w:eastAsia="Calibri" w:hAnsi="Calibri"/>
+                <w:b w:val="false"/>
+                <w:bCs w:val="false"/>
+                <w:color w:val="000000"/>
+                <w:sz w:val="20"/>
+                <w:szCs w:val="20"/>
+              </w:rPr>
+              <w:t xml:space="preserve">executes</w:t>
+            </w:r>
+          </w:p>
+        </w:tc>
+        <w:tc>
+          <w:tcPr>
+            <w:tcW w:type="dxa" w:w="4100"/>
+            <w:tcMar>
+              <w:top w:type="dxa" w:w="40"/>
+              <w:left w:type="dxa" w:w="80"/>
+              <w:bottom w:type="dxa" w:w="40"/>
+              <w:right w:type="dxa" w:w="80"/>
+            </w:tcMar>
+          </w:tcPr>
+          <w:p>
+            <w:pPr>
+              <w:spacing w:after="0" w:line="260"/>
+            </w:pPr>
+            <w:r>
+              <w:rPr>
+                <w:rFonts w:ascii="Calibri" w:cs="Calibri" w:eastAsia="Calibri" w:hAnsi="Calibri"/>
+                <w:b w:val="false"/>
+                <w:bCs w:val="false"/>
+                <w:color w:val="000000"/>
+                <w:sz w:val="20"/>
+                <w:szCs w:val="20"/>
+              </w:rPr>
+              <w:t xml:space="preserve">0.935</w:t>
+            </w:r>
+          </w:p>
+        </w:tc>
+        <w:tc>
+          <w:tcPr>
             <w:tcW w:type="dxa" w:w="3026"/>
             <w:tcMar>
               <w:top w:type="dxa" w:w="40"/>
@@ -7018,34 +7714,7 @@
                 <w:sz w:val="20"/>
                 <w:szCs w:val="20"/>
               </w:rPr>
-              <w:t xml:space="preserve">decoding / prompt</w:t>
-            </w:r>
-          </w:p>
-        </w:tc>
-        <w:tc>
-          <w:tcPr>
-            <w:tcW w:type="dxa" w:w="6000"/>
-            <w:tcMar>
-              <w:top w:type="dxa" w:w="40"/>
-              <w:left w:type="dxa" w:w="80"/>
-              <w:bottom w:type="dxa" w:w="40"/>
-              <w:right w:type="dxa" w:w="80"/>
-            </w:tcMar>
-          </w:tcPr>
-          <w:p>
-            <w:pPr>
-              <w:spacing w:after="0" w:line="260"/>
-            </w:pPr>
-            <w:r>
-              <w:rPr>
-                <w:rFonts w:ascii="Calibri" w:cs="Calibri" w:eastAsia="Calibri" w:hAnsi="Calibri"/>
-                <w:b w:val="false"/>
-                <w:bCs w:val="false"/>
-                <w:color w:val="000000"/>
-                <w:sz w:val="20"/>
-                <w:szCs w:val="20"/>
-              </w:rPr>
-              <w:t xml:space="preserve">beam search (4); schema + foreign-keys prompt</w:t>
+              <w:t xml:space="preserve">0.929</w:t>
             </w:r>
           </w:p>
         </w:tc>
@@ -7053,6 +7722,62 @@
       <w:tr>
         <w:tc>
           <w:tcPr>
+            <w:tcW w:type="dxa" w:w="1900"/>
+            <w:shd w:fill="EAF0F9" w:color="auto" w:val="clear"/>
+            <w:tcMar>
+              <w:top w:type="dxa" w:w="40"/>
+              <w:left w:type="dxa" w:w="80"/>
+              <w:bottom w:type="dxa" w:w="40"/>
+              <w:right w:type="dxa" w:w="80"/>
+            </w:tcMar>
+          </w:tcPr>
+          <w:p>
+            <w:pPr>
+              <w:spacing w:after="0" w:line="260"/>
+            </w:pPr>
+            <w:r>
+              <w:rPr>
+                <w:rFonts w:ascii="Calibri" w:cs="Calibri" w:eastAsia="Calibri" w:hAnsi="Calibri"/>
+                <w:b w:val="false"/>
+                <w:bCs w:val="false"/>
+                <w:color w:val="000000"/>
+                <w:sz w:val="20"/>
+                <w:szCs w:val="20"/>
+              </w:rPr>
+              <w:t xml:space="preserve">decoding</w:t>
+            </w:r>
+          </w:p>
+        </w:tc>
+        <w:tc>
+          <w:tcPr>
+            <w:tcW w:type="dxa" w:w="4100"/>
+            <w:shd w:fill="EAF0F9" w:color="auto" w:val="clear"/>
+            <w:tcMar>
+              <w:top w:type="dxa" w:w="40"/>
+              <w:left w:type="dxa" w:w="80"/>
+              <w:bottom w:type="dxa" w:w="40"/>
+              <w:right w:type="dxa" w:w="80"/>
+            </w:tcMar>
+          </w:tcPr>
+          <w:p>
+            <w:pPr>
+              <w:spacing w:after="0" w:line="260"/>
+            </w:pPr>
+            <w:r>
+              <w:rPr>
+                <w:rFonts w:ascii="Calibri" w:cs="Calibri" w:eastAsia="Calibri" w:hAnsi="Calibri"/>
+                <w:b w:val="false"/>
+                <w:bCs w:val="false"/>
+                <w:color w:val="000000"/>
+                <w:sz w:val="20"/>
+                <w:szCs w:val="20"/>
+              </w:rPr>
+              <w:t xml:space="preserve">beam search (4)</w:t>
+            </w:r>
+          </w:p>
+        </w:tc>
+        <w:tc>
+          <w:tcPr>
             <w:tcW w:type="dxa" w:w="3026"/>
             <w:shd w:fill="EAF0F9" w:color="auto" w:val="clear"/>
             <w:tcMar>
@@ -7075,35 +7800,7 @@
                 <w:sz w:val="20"/>
                 <w:szCs w:val="20"/>
               </w:rPr>
-              <w:t xml:space="preserve">runtime / hardware</w:t>
-            </w:r>
-          </w:p>
-        </w:tc>
-        <w:tc>
-          <w:tcPr>
-            <w:tcW w:type="dxa" w:w="6000"/>
-            <w:shd w:fill="EAF0F9" w:color="auto" w:val="clear"/>
-            <w:tcMar>
-              <w:top w:type="dxa" w:w="40"/>
-              <w:left w:type="dxa" w:w="80"/>
-              <w:bottom w:type="dxa" w:w="40"/>
-              <w:right w:type="dxa" w:w="80"/>
-            </w:tcMar>
-          </w:tcPr>
-          <w:p>
-            <w:pPr>
-              <w:spacing w:after="0" w:line="260"/>
-            </w:pPr>
-            <w:r>
-              <w:rPr>
-                <w:rFonts w:ascii="Calibri" w:cs="Calibri" w:eastAsia="Calibri" w:hAnsi="Calibri"/>
-                <w:b w:val="false"/>
-                <w:bCs w:val="false"/>
-                <w:color w:val="000000"/>
-                <w:sz w:val="20"/>
-                <w:szCs w:val="20"/>
-              </w:rPr>
-              <w:t xml:space="preserve">6,538 s on Apple M4 (MPS), bf16</w:t>
+              <w:t xml:space="preserve">beam search (4)</w:t>
             </w:r>
           </w:p>
         </w:tc>
@@ -7111,6 +7808,60 @@
       <w:tr>
         <w:tc>
           <w:tcPr>
+            <w:tcW w:type="dxa" w:w="1900"/>
+            <w:tcMar>
+              <w:top w:type="dxa" w:w="40"/>
+              <w:left w:type="dxa" w:w="80"/>
+              <w:bottom w:type="dxa" w:w="40"/>
+              <w:right w:type="dxa" w:w="80"/>
+            </w:tcMar>
+          </w:tcPr>
+          <w:p>
+            <w:pPr>
+              <w:spacing w:after="0" w:line="260"/>
+            </w:pPr>
+            <w:r>
+              <w:rPr>
+                <w:rFonts w:ascii="Calibri" w:cs="Calibri" w:eastAsia="Calibri" w:hAnsi="Calibri"/>
+                <w:b w:val="false"/>
+                <w:bCs w:val="false"/>
+                <w:color w:val="000000"/>
+                <w:sz w:val="20"/>
+                <w:szCs w:val="20"/>
+              </w:rPr>
+              <w:t xml:space="preserve">hardware</w:t>
+            </w:r>
+          </w:p>
+        </w:tc>
+        <w:tc>
+          <w:tcPr>
+            <w:tcW w:type="dxa" w:w="4100"/>
+            <w:tcMar>
+              <w:top w:type="dxa" w:w="40"/>
+              <w:left w:type="dxa" w:w="80"/>
+              <w:bottom w:type="dxa" w:w="40"/>
+              <w:right w:type="dxa" w:w="80"/>
+            </w:tcMar>
+          </w:tcPr>
+          <w:p>
+            <w:pPr>
+              <w:spacing w:after="0" w:line="260"/>
+            </w:pPr>
+            <w:r>
+              <w:rPr>
+                <w:rFonts w:ascii="Calibri" w:cs="Calibri" w:eastAsia="Calibri" w:hAnsi="Calibri"/>
+                <w:b w:val="false"/>
+                <w:bCs w:val="false"/>
+                <w:color w:val="000000"/>
+                <w:sz w:val="20"/>
+                <w:szCs w:val="20"/>
+              </w:rPr>
+              <w:t xml:space="preserve">Tesla T4 (Colab)</w:t>
+            </w:r>
+          </w:p>
+        </w:tc>
+        <w:tc>
+          <w:tcPr>
             <w:tcW w:type="dxa" w:w="3026"/>
             <w:tcMar>
               <w:top w:type="dxa" w:w="40"/>
@@ -7132,34 +7883,7 @@
                 <w:sz w:val="20"/>
                 <w:szCs w:val="20"/>
               </w:rPr>
-              <w:t xml:space="preserve">target / tolerance</w:t>
-            </w:r>
-          </w:p>
-        </w:tc>
-        <w:tc>
-          <w:tcPr>
-            <w:tcW w:type="dxa" w:w="6000"/>
-            <w:tcMar>
-              <w:top w:type="dxa" w:w="40"/>
-              <w:left w:type="dxa" w:w="80"/>
-              <w:bottom w:type="dxa" w:w="40"/>
-              <w:right w:type="dxa" w:w="80"/>
-            </w:tcMar>
-          </w:tcPr>
-          <w:p>
-            <w:pPr>
-              <w:spacing w:after="0" w:line="260"/>
-            </w:pPr>
-            <w:r>
-              <w:rPr>
-                <w:rFonts w:ascii="Calibri" w:cs="Calibri" w:eastAsia="Calibri" w:hAnsi="Calibri"/>
-                <w:b w:val="false"/>
-                <w:bCs w:val="false"/>
-                <w:color w:val="000000"/>
-                <w:sz w:val="20"/>
-                <w:szCs w:val="20"/>
-              </w:rPr>
-              <w:t xml:space="preserve">paper 77.9%; outside ±10% (70.1–85.7%) — documented cause: prompt fidelity</w:t>
+              <w:t xml:space="preserve">Apple M4 (MPS)</w:t>
             </w:r>
           </w:p>
         </w:tc>
@@ -7167,6 +7891,62 @@
       <w:tr>
         <w:tc>
           <w:tcPr>
+            <w:tcW w:type="dxa" w:w="1900"/>
+            <w:shd w:fill="EAF0F9" w:color="auto" w:val="clear"/>
+            <w:tcMar>
+              <w:top w:type="dxa" w:w="40"/>
+              <w:left w:type="dxa" w:w="80"/>
+              <w:bottom w:type="dxa" w:w="40"/>
+              <w:right w:type="dxa" w:w="80"/>
+            </w:tcMar>
+          </w:tcPr>
+          <w:p>
+            <w:pPr>
+              <w:spacing w:after="0" w:line="260"/>
+            </w:pPr>
+            <w:r>
+              <w:rPr>
+                <w:rFonts w:ascii="Calibri" w:cs="Calibri" w:eastAsia="Calibri" w:hAnsi="Calibri"/>
+                <w:b w:val="false"/>
+                <w:bCs w:val="false"/>
+                <w:color w:val="000000"/>
+                <w:sz w:val="20"/>
+                <w:szCs w:val="20"/>
+              </w:rPr>
+              <w:t xml:space="preserve">vs 77.9%</w:t>
+            </w:r>
+          </w:p>
+        </w:tc>
+        <w:tc>
+          <w:tcPr>
+            <w:tcW w:type="dxa" w:w="4100"/>
+            <w:shd w:fill="EAF0F9" w:color="auto" w:val="clear"/>
+            <w:tcMar>
+              <w:top w:type="dxa" w:w="40"/>
+              <w:left w:type="dxa" w:w="80"/>
+              <w:bottom w:type="dxa" w:w="40"/>
+              <w:right w:type="dxa" w:w="80"/>
+            </w:tcMar>
+          </w:tcPr>
+          <w:p>
+            <w:pPr>
+              <w:spacing w:after="0" w:line="260"/>
+            </w:pPr>
+            <w:r>
+              <w:rPr>
+                <w:rFonts w:ascii="Calibri" w:cs="Calibri" w:eastAsia="Calibri" w:hAnsi="Calibri"/>
+                <w:b w:val="false"/>
+                <w:bCs w:val="false"/>
+                <w:color w:val="000000"/>
+                <w:sz w:val="20"/>
+                <w:szCs w:val="20"/>
+              </w:rPr>
+              <w:t xml:space="preserve">within ±10% (~8% rel.)</w:t>
+            </w:r>
+          </w:p>
+        </w:tc>
+        <w:tc>
+          <w:tcPr>
             <w:tcW w:type="dxa" w:w="3026"/>
             <w:shd w:fill="EAF0F9" w:color="auto" w:val="clear"/>
             <w:tcMar>
@@ -7189,35 +7969,7 @@
                 <w:sz w:val="20"/>
                 <w:szCs w:val="20"/>
               </w:rPr>
-              <w:t xml:space="preserve">date</w:t>
-            </w:r>
-          </w:p>
-        </w:tc>
-        <w:tc>
-          <w:tcPr>
-            <w:tcW w:type="dxa" w:w="6000"/>
-            <w:shd w:fill="EAF0F9" w:color="auto" w:val="clear"/>
-            <w:tcMar>
-              <w:top w:type="dxa" w:w="40"/>
-              <w:left w:type="dxa" w:w="80"/>
-              <w:bottom w:type="dxa" w:w="40"/>
-              <w:right w:type="dxa" w:w="80"/>
-            </w:tcMar>
-          </w:tcPr>
-          <w:p>
-            <w:pPr>
-              <w:spacing w:after="0" w:line="260"/>
-            </w:pPr>
-            <w:r>
-              <w:rPr>
-                <w:rFonts w:ascii="Calibri" w:cs="Calibri" w:eastAsia="Calibri" w:hAnsi="Calibri"/>
-                <w:b w:val="false"/>
-                <w:bCs w:val="false"/>
-                <w:color w:val="000000"/>
-                <w:sz w:val="20"/>
-                <w:szCs w:val="20"/>
-              </w:rPr>
-              <w:t xml:space="preserve">2026-08-26</w:t>
+              <w:t xml:space="preserve">outside ±10%</w:t>
             </w:r>
           </w:p>
         </w:tc>

</xml_diff>

<commit_message>
Team: list M Praneeth Reddy on all records; Boddupally spelling everywhere
Weekly reports 1-12 (ID line), Week-1 abstract and deck, Week-3 worksheet,
Review-II deck, reproducibility report v1. Abstract kept to one page
(removed a blank line before the signature); proposal verified still one
page in Word.

Co-Authored-By: Claude Opus 5.5 <noreply@anthropic.com>
</commit_message>
<xml_diff>
--- a/docs/Code_Reproducibility_Report_v1.docx
+++ b/docs/Code_Reproducibility_Report_v1.docx
@@ -108,7 +108,21 @@
           <w:sz w:val="22"/>
           <w:szCs w:val="22"/>
         </w:rPr>
-        <w:t xml:space="preserve">2320090009 — Bodupally Narendar</w:t>
+        <w:t>2320090009 — Boddupally Narendar</w:t>
+      </w:r>
+    </w:p>
+    <w:p>
+      <w:pPr>
+        <w:spacing w:after="240" w:line="276"/>
+        <w:jc w:val="center"/>
+      </w:pPr>
+      <w:r>
+        <w:rPr>
+          <w:rFonts w:ascii="Calibri" w:cs="Calibri" w:eastAsia="Calibri" w:hAnsi="Calibri"/>
+          <w:sz w:val="22"/>
+          <w:szCs w:val="22"/>
+        </w:rPr>
+        <w:t>2320090018 — M Praneeth Reddy</w:t>
       </w:r>
     </w:p>
     <w:p>

</xml_diff>